<commit_message>
Rebuild Lecture 8 with 11 inline images from PDF slides
</commit_message>
<xml_diff>
--- a/SCE_ConnectAC_Study_Guide_Lec1-8.docx
+++ b/SCE_ConnectAC_Study_Guide_Lec1-8.docx
@@ -56097,6 +56097,42 @@
       </w:r>
     </w:p>
     <w:p>
+      <w:r>
+        <w:drawing>
+          <wp:inline xmlns:a="http://schemas.openxmlformats.org/drawingml/2006/main" xmlns:pic="http://schemas.openxmlformats.org/drawingml/2006/picture">
+            <wp:extent cx="4572000" cy="2571750"/>
+            <wp:docPr id="1" name="Picture 1"/>
+            <wp:cNvGraphicFramePr>
+              <a:graphicFrameLocks noChangeAspect="1"/>
+            </wp:cNvGraphicFramePr>
+            <a:graphic>
+              <a:graphicData uri="http://schemas.openxmlformats.org/drawingml/2006/picture">
+                <pic:pic>
+                  <pic:nvPicPr>
+                    <pic:cNvPr id="0" name="image.jpg"/>
+                    <pic:cNvPicPr/>
+                  </pic:nvPicPr>
+                  <pic:blipFill>
+                    <a:blip r:embed="rId8"/>
+                    <a:stretch>
+                      <a:fillRect/>
+                    </a:stretch>
+                  </pic:blipFill>
+                  <pic:spPr>
+                    <a:xfrm>
+                      <a:off x="0" y="0"/>
+                      <a:ext cx="4572000" cy="2571750"/>
+                    </a:xfrm>
+                    <a:prstGeom prst="rect"/>
+                  </pic:spPr>
+                </pic:pic>
+              </a:graphicData>
+            </a:graphic>
+          </wp:inline>
+        </w:drawing>
+      </w:r>
+    </w:p>
+    <w:p>
       <w:pPr>
         <w:pStyle w:val="ListBullet"/>
       </w:pPr>
@@ -56341,6 +56377,42 @@
       </w:r>
     </w:p>
     <w:p>
+      <w:r>
+        <w:drawing>
+          <wp:inline xmlns:a="http://schemas.openxmlformats.org/drawingml/2006/main" xmlns:pic="http://schemas.openxmlformats.org/drawingml/2006/picture">
+            <wp:extent cx="4572000" cy="2571750"/>
+            <wp:docPr id="2" name="Picture 2"/>
+            <wp:cNvGraphicFramePr>
+              <a:graphicFrameLocks noChangeAspect="1"/>
+            </wp:cNvGraphicFramePr>
+            <a:graphic>
+              <a:graphicData uri="http://schemas.openxmlformats.org/drawingml/2006/picture">
+                <pic:pic>
+                  <pic:nvPicPr>
+                    <pic:cNvPr id="0" name="image.jpg"/>
+                    <pic:cNvPicPr/>
+                  </pic:nvPicPr>
+                  <pic:blipFill>
+                    <a:blip r:embed="rId9"/>
+                    <a:stretch>
+                      <a:fillRect/>
+                    </a:stretch>
+                  </pic:blipFill>
+                  <pic:spPr>
+                    <a:xfrm>
+                      <a:off x="0" y="0"/>
+                      <a:ext cx="4572000" cy="2571750"/>
+                    </a:xfrm>
+                    <a:prstGeom prst="rect"/>
+                  </pic:spPr>
+                </pic:pic>
+              </a:graphicData>
+            </a:graphic>
+          </wp:inline>
+        </w:drawing>
+      </w:r>
+    </w:p>
+    <w:p>
       <w:pPr>
         <w:pStyle w:val="ListBullet"/>
       </w:pPr>
@@ -56885,6 +56957,42 @@
       </w:r>
     </w:p>
     <w:p>
+      <w:r>
+        <w:drawing>
+          <wp:inline xmlns:a="http://schemas.openxmlformats.org/drawingml/2006/main" xmlns:pic="http://schemas.openxmlformats.org/drawingml/2006/picture">
+            <wp:extent cx="4572000" cy="2571750"/>
+            <wp:docPr id="3" name="Picture 3"/>
+            <wp:cNvGraphicFramePr>
+              <a:graphicFrameLocks noChangeAspect="1"/>
+            </wp:cNvGraphicFramePr>
+            <a:graphic>
+              <a:graphicData uri="http://schemas.openxmlformats.org/drawingml/2006/picture">
+                <pic:pic>
+                  <pic:nvPicPr>
+                    <pic:cNvPr id="0" name="image.jpg"/>
+                    <pic:cNvPicPr/>
+                  </pic:nvPicPr>
+                  <pic:blipFill>
+                    <a:blip r:embed="rId10"/>
+                    <a:stretch>
+                      <a:fillRect/>
+                    </a:stretch>
+                  </pic:blipFill>
+                  <pic:spPr>
+                    <a:xfrm>
+                      <a:off x="0" y="0"/>
+                      <a:ext cx="4572000" cy="2571750"/>
+                    </a:xfrm>
+                    <a:prstGeom prst="rect"/>
+                  </pic:spPr>
+                </pic:pic>
+              </a:graphicData>
+            </a:graphic>
+          </wp:inline>
+        </w:drawing>
+      </w:r>
+    </w:p>
+    <w:p>
       <w:pPr>
         <w:pStyle w:val="Heading3"/>
       </w:pPr>
@@ -57253,6 +57361,42 @@
       </w:r>
     </w:p>
     <w:p>
+      <w:r>
+        <w:drawing>
+          <wp:inline xmlns:a="http://schemas.openxmlformats.org/drawingml/2006/main" xmlns:pic="http://schemas.openxmlformats.org/drawingml/2006/picture">
+            <wp:extent cx="4572000" cy="2571750"/>
+            <wp:docPr id="4" name="Picture 4"/>
+            <wp:cNvGraphicFramePr>
+              <a:graphicFrameLocks noChangeAspect="1"/>
+            </wp:cNvGraphicFramePr>
+            <a:graphic>
+              <a:graphicData uri="http://schemas.openxmlformats.org/drawingml/2006/picture">
+                <pic:pic>
+                  <pic:nvPicPr>
+                    <pic:cNvPr id="0" name="image.jpg"/>
+                    <pic:cNvPicPr/>
+                  </pic:nvPicPr>
+                  <pic:blipFill>
+                    <a:blip r:embed="rId11"/>
+                    <a:stretch>
+                      <a:fillRect/>
+                    </a:stretch>
+                  </pic:blipFill>
+                  <pic:spPr>
+                    <a:xfrm>
+                      <a:off x="0" y="0"/>
+                      <a:ext cx="4572000" cy="2571750"/>
+                    </a:xfrm>
+                    <a:prstGeom prst="rect"/>
+                  </pic:spPr>
+                </pic:pic>
+              </a:graphicData>
+            </a:graphic>
+          </wp:inline>
+        </w:drawing>
+      </w:r>
+    </w:p>
+    <w:p>
       <w:pPr>
         <w:pStyle w:val="ListBullet"/>
       </w:pPr>
@@ -57462,6 +57606,42 @@
       </w:r>
     </w:p>
     <w:p>
+      <w:r>
+        <w:drawing>
+          <wp:inline xmlns:a="http://schemas.openxmlformats.org/drawingml/2006/main" xmlns:pic="http://schemas.openxmlformats.org/drawingml/2006/picture">
+            <wp:extent cx="4572000" cy="2571750"/>
+            <wp:docPr id="5" name="Picture 5"/>
+            <wp:cNvGraphicFramePr>
+              <a:graphicFrameLocks noChangeAspect="1"/>
+            </wp:cNvGraphicFramePr>
+            <a:graphic>
+              <a:graphicData uri="http://schemas.openxmlformats.org/drawingml/2006/picture">
+                <pic:pic>
+                  <pic:nvPicPr>
+                    <pic:cNvPr id="0" name="image.jpg"/>
+                    <pic:cNvPicPr/>
+                  </pic:nvPicPr>
+                  <pic:blipFill>
+                    <a:blip r:embed="rId12"/>
+                    <a:stretch>
+                      <a:fillRect/>
+                    </a:stretch>
+                  </pic:blipFill>
+                  <pic:spPr>
+                    <a:xfrm>
+                      <a:off x="0" y="0"/>
+                      <a:ext cx="4572000" cy="2571750"/>
+                    </a:xfrm>
+                    <a:prstGeom prst="rect"/>
+                  </pic:spPr>
+                </pic:pic>
+              </a:graphicData>
+            </a:graphic>
+          </wp:inline>
+        </w:drawing>
+      </w:r>
+    </w:p>
+    <w:p>
       <w:pPr>
         <w:pStyle w:val="ListBullet"/>
       </w:pPr>
@@ -57747,6 +57927,42 @@
       </w:r>
     </w:p>
     <w:p>
+      <w:r>
+        <w:drawing>
+          <wp:inline xmlns:a="http://schemas.openxmlformats.org/drawingml/2006/main" xmlns:pic="http://schemas.openxmlformats.org/drawingml/2006/picture">
+            <wp:extent cx="4572000" cy="2571750"/>
+            <wp:docPr id="6" name="Picture 6"/>
+            <wp:cNvGraphicFramePr>
+              <a:graphicFrameLocks noChangeAspect="1"/>
+            </wp:cNvGraphicFramePr>
+            <a:graphic>
+              <a:graphicData uri="http://schemas.openxmlformats.org/drawingml/2006/picture">
+                <pic:pic>
+                  <pic:nvPicPr>
+                    <pic:cNvPr id="0" name="image.jpg"/>
+                    <pic:cNvPicPr/>
+                  </pic:nvPicPr>
+                  <pic:blipFill>
+                    <a:blip r:embed="rId13"/>
+                    <a:stretch>
+                      <a:fillRect/>
+                    </a:stretch>
+                  </pic:blipFill>
+                  <pic:spPr>
+                    <a:xfrm>
+                      <a:off x="0" y="0"/>
+                      <a:ext cx="4572000" cy="2571750"/>
+                    </a:xfrm>
+                    <a:prstGeom prst="rect"/>
+                  </pic:spPr>
+                </pic:pic>
+              </a:graphicData>
+            </a:graphic>
+          </wp:inline>
+        </w:drawing>
+      </w:r>
+    </w:p>
+    <w:p>
       <w:pPr>
         <w:pStyle w:val="ListBullet"/>
       </w:pPr>
@@ -57911,6 +58127,42 @@
       </w:r>
     </w:p>
     <w:p>
+      <w:r>
+        <w:drawing>
+          <wp:inline xmlns:a="http://schemas.openxmlformats.org/drawingml/2006/main" xmlns:pic="http://schemas.openxmlformats.org/drawingml/2006/picture">
+            <wp:extent cx="4572000" cy="2571750"/>
+            <wp:docPr id="7" name="Picture 7"/>
+            <wp:cNvGraphicFramePr>
+              <a:graphicFrameLocks noChangeAspect="1"/>
+            </wp:cNvGraphicFramePr>
+            <a:graphic>
+              <a:graphicData uri="http://schemas.openxmlformats.org/drawingml/2006/picture">
+                <pic:pic>
+                  <pic:nvPicPr>
+                    <pic:cNvPr id="0" name="image.jpg"/>
+                    <pic:cNvPicPr/>
+                  </pic:nvPicPr>
+                  <pic:blipFill>
+                    <a:blip r:embed="rId14"/>
+                    <a:stretch>
+                      <a:fillRect/>
+                    </a:stretch>
+                  </pic:blipFill>
+                  <pic:spPr>
+                    <a:xfrm>
+                      <a:off x="0" y="0"/>
+                      <a:ext cx="4572000" cy="2571750"/>
+                    </a:xfrm>
+                    <a:prstGeom prst="rect"/>
+                  </pic:spPr>
+                </pic:pic>
+              </a:graphicData>
+            </a:graphic>
+          </wp:inline>
+        </w:drawing>
+      </w:r>
+    </w:p>
+    <w:p>
       <w:pPr>
         <w:pStyle w:val="ListBullet"/>
       </w:pPr>
@@ -58045,6 +58297,42 @@
       </w:r>
     </w:p>
     <w:p>
+      <w:r>
+        <w:drawing>
+          <wp:inline xmlns:a="http://schemas.openxmlformats.org/drawingml/2006/main" xmlns:pic="http://schemas.openxmlformats.org/drawingml/2006/picture">
+            <wp:extent cx="4572000" cy="2571750"/>
+            <wp:docPr id="8" name="Picture 8"/>
+            <wp:cNvGraphicFramePr>
+              <a:graphicFrameLocks noChangeAspect="1"/>
+            </wp:cNvGraphicFramePr>
+            <a:graphic>
+              <a:graphicData uri="http://schemas.openxmlformats.org/drawingml/2006/picture">
+                <pic:pic>
+                  <pic:nvPicPr>
+                    <pic:cNvPr id="0" name="image.jpg"/>
+                    <pic:cNvPicPr/>
+                  </pic:nvPicPr>
+                  <pic:blipFill>
+                    <a:blip r:embed="rId15"/>
+                    <a:stretch>
+                      <a:fillRect/>
+                    </a:stretch>
+                  </pic:blipFill>
+                  <pic:spPr>
+                    <a:xfrm>
+                      <a:off x="0" y="0"/>
+                      <a:ext cx="4572000" cy="2571750"/>
+                    </a:xfrm>
+                    <a:prstGeom prst="rect"/>
+                  </pic:spPr>
+                </pic:pic>
+              </a:graphicData>
+            </a:graphic>
+          </wp:inline>
+        </w:drawing>
+      </w:r>
+    </w:p>
+    <w:p>
       <w:pPr>
         <w:pStyle w:val="ListBullet"/>
       </w:pPr>
@@ -58239,6 +58527,42 @@
       </w:r>
     </w:p>
     <w:p>
+      <w:r>
+        <w:drawing>
+          <wp:inline xmlns:a="http://schemas.openxmlformats.org/drawingml/2006/main" xmlns:pic="http://schemas.openxmlformats.org/drawingml/2006/picture">
+            <wp:extent cx="4572000" cy="2571750"/>
+            <wp:docPr id="9" name="Picture 9"/>
+            <wp:cNvGraphicFramePr>
+              <a:graphicFrameLocks noChangeAspect="1"/>
+            </wp:cNvGraphicFramePr>
+            <a:graphic>
+              <a:graphicData uri="http://schemas.openxmlformats.org/drawingml/2006/picture">
+                <pic:pic>
+                  <pic:nvPicPr>
+                    <pic:cNvPr id="0" name="image.jpg"/>
+                    <pic:cNvPicPr/>
+                  </pic:nvPicPr>
+                  <pic:blipFill>
+                    <a:blip r:embed="rId16"/>
+                    <a:stretch>
+                      <a:fillRect/>
+                    </a:stretch>
+                  </pic:blipFill>
+                  <pic:spPr>
+                    <a:xfrm>
+                      <a:off x="0" y="0"/>
+                      <a:ext cx="4572000" cy="2571750"/>
+                    </a:xfrm>
+                    <a:prstGeom prst="rect"/>
+                  </pic:spPr>
+                </pic:pic>
+              </a:graphicData>
+            </a:graphic>
+          </wp:inline>
+        </w:drawing>
+      </w:r>
+    </w:p>
+    <w:p>
       <w:pPr>
         <w:pStyle w:val="Heading3"/>
       </w:pPr>
@@ -58535,6 +58859,42 @@
       </w:r>
     </w:p>
     <w:p>
+      <w:r>
+        <w:drawing>
+          <wp:inline xmlns:a="http://schemas.openxmlformats.org/drawingml/2006/main" xmlns:pic="http://schemas.openxmlformats.org/drawingml/2006/picture">
+            <wp:extent cx="4572000" cy="2571750"/>
+            <wp:docPr id="10" name="Picture 10"/>
+            <wp:cNvGraphicFramePr>
+              <a:graphicFrameLocks noChangeAspect="1"/>
+            </wp:cNvGraphicFramePr>
+            <a:graphic>
+              <a:graphicData uri="http://schemas.openxmlformats.org/drawingml/2006/picture">
+                <pic:pic>
+                  <pic:nvPicPr>
+                    <pic:cNvPr id="0" name="image.jpg"/>
+                    <pic:cNvPicPr/>
+                  </pic:nvPicPr>
+                  <pic:blipFill>
+                    <a:blip r:embed="rId17"/>
+                    <a:stretch>
+                      <a:fillRect/>
+                    </a:stretch>
+                  </pic:blipFill>
+                  <pic:spPr>
+                    <a:xfrm>
+                      <a:off x="0" y="0"/>
+                      <a:ext cx="4572000" cy="2571750"/>
+                    </a:xfrm>
+                    <a:prstGeom prst="rect"/>
+                  </pic:spPr>
+                </pic:pic>
+              </a:graphicData>
+            </a:graphic>
+          </wp:inline>
+        </w:drawing>
+      </w:r>
+    </w:p>
+    <w:p>
       <w:pPr>
         <w:pStyle w:val="ListBullet"/>
       </w:pPr>
@@ -58631,6 +58991,42 @@
       </w:pPr>
       <w:r>
         <w:t>Causes in Adults — Mnemonic "BAD"</w:t>
+      </w:r>
+    </w:p>
+    <w:p>
+      <w:r>
+        <w:drawing>
+          <wp:inline xmlns:a="http://schemas.openxmlformats.org/drawingml/2006/main" xmlns:pic="http://schemas.openxmlformats.org/drawingml/2006/picture">
+            <wp:extent cx="4572000" cy="2571750"/>
+            <wp:docPr id="11" name="Picture 11"/>
+            <wp:cNvGraphicFramePr>
+              <a:graphicFrameLocks noChangeAspect="1"/>
+            </wp:cNvGraphicFramePr>
+            <a:graphic>
+              <a:graphicData uri="http://schemas.openxmlformats.org/drawingml/2006/picture">
+                <pic:pic>
+                  <pic:nvPicPr>
+                    <pic:cNvPr id="0" name="image.jpg"/>
+                    <pic:cNvPicPr/>
+                  </pic:nvPicPr>
+                  <pic:blipFill>
+                    <a:blip r:embed="rId18"/>
+                    <a:stretch>
+                      <a:fillRect/>
+                    </a:stretch>
+                  </pic:blipFill>
+                  <pic:spPr>
+                    <a:xfrm>
+                      <a:off x="0" y="0"/>
+                      <a:ext cx="4572000" cy="2571750"/>
+                    </a:xfrm>
+                    <a:prstGeom prst="rect"/>
+                  </pic:spPr>
+                </pic:pic>
+              </a:graphicData>
+            </a:graphic>
+          </wp:inline>
+        </w:drawing>
       </w:r>
     </w:p>
     <w:p>

</xml_diff>